<commit_message>
Update Technical Handbook and User Guide manuals to match recent changes
Technical Handbook gains a new section on market-hours/holiday-calendar
gating and a note on tracking-only instruments (the GLD fabricated-
analysis bug and fix). User Guide's Dashboard section now mentions the
Commodities tab, and Paper Trading section notes that orders are
blocked while the market is closed.

Co-Authored-By: Claude Sonnet 4.6 <noreply@anthropic.com>
</commit_message>
<xml_diff>
--- a/StockSense360_Technical_Handbook.docx
+++ b/StockSense360_Technical_Handbook.docx
@@ -1999,7 +1999,62 @@
         <w:spacing w:after="160"/>
       </w:pPr>
       <w:r>
-        <w:t xml:space="preserve">Validation runs separately across three universes — Nifty 100, NSE midcap, and a US basket — each tracked independently so US results never overwrite India results (a real bug fixed in Session 7, see Section 6).</w:t>
+        <w:t xml:space="preserve">Validation runs separately across three universes — Nifty 100, NSE midcap, and a US basket — each tracked independently so US results never overwrite India results (a real bug fixed in Session 7, see Section 7).</w:t>
+      </w:r>
+    </w:p>
+    <w:p>
+      <w:pPr>
+        <w:pStyle w:val="Heading2"/>
+      </w:pPr>
+      <w:r>
+        <w:t xml:space="preserve">2.5 Tracking-only instruments (no fundamentals)</w:t>
+      </w:r>
+    </w:p>
+    <w:p>
+      <w:pPr>
+        <w:spacing w:after="160"/>
+      </w:pPr>
+      <w:r>
+        <w:t xml:space="preserve">Not every symbol in the universe has real company fundamentals — commodity ETFs (GLD, SLV, GOLDBEES, SILVERBEES) and crypto have no P/E, ROE, or balance sheet to score. Running them through the full fundamentals/sentiment/quality pipeline was tried and produced fabricated, sometimes nonsensical analysis (a US gold ETF's bear case once claimed it was "underperforming the Nifty 50 benchmark") — confidently wrong rather than honestly limited.</w:t>
+      </w:r>
+    </w:p>
+    <w:p>
+      <w:pPr>
+        <w:pStyle w:val="ListParagraph"/>
+        <w:numPr>
+          <w:ilvl w:val="0"/>
+          <w:numId w:val="2"/>
+        </w:numPr>
+        <w:spacing w:after="80"/>
+      </w:pPr>
+      <w:r>
+        <w:t xml:space="preserve">Crypto (crypto_engine.py) was already designed correctly from the start: technical indicators + a volatility-based "fear/greed" proxy + a volume-based "on-chain" proxy, explicitly documented as no-fundamentals.</w:t>
+      </w:r>
+    </w:p>
+    <w:p>
+      <w:pPr>
+        <w:pStyle w:val="ListParagraph"/>
+        <w:numPr>
+          <w:ilvl w:val="0"/>
+          <w:numId w:val="2"/>
+        </w:numPr>
+        <w:spacing w:after="80"/>
+      </w:pPr>
+      <w:r>
+        <w:t xml:space="preserve">Commodity ETFs needed a fix (Session 7): PredictionEngine.predict() now has an early-return branch for a TRACKING_ONLY_SYMBOLS set (stock_universe.py) that computes the signal from real technical indicators only and skips fundamentals/sentiment/quality/bull-bear-case entirely, returning a tracking_only flag and an honest note instead.</w:t>
+      </w:r>
+    </w:p>
+    <w:p>
+      <w:pPr>
+        <w:pStyle w:val="ListParagraph"/>
+        <w:numPr>
+          <w:ilvl w:val="0"/>
+          <w:numId w:val="2"/>
+        </w:numPr>
+        <w:spacing w:after="80"/>
+      </w:pPr>
+      <w:r>
+        <w:t xml:space="preserve">Frontend: the stock detail page shows a clear "price-tracking instrument" banner and hides Bull/Bear Case, Factor Attribution, and Academic Quality Signals when tracking_only is set. The Fundamentals tab (screener.in data, India-only) is hidden entirely for any non-IN market, since it can only ever be a dead end there.</w:t>
       </w:r>
     </w:p>
     <w:p>
@@ -2164,7 +2219,7 @@
                 <w:sz w:val="20"/>
                 <w:szCs w:val="20"/>
               </w:rPr>
-              <w:t xml:space="preserve">One row per user — virtual cash balance, email for notifications</w:t>
+              <w:t xml:space="preserve">One row per user — virtual cash balance, email for proximity notifications</w:t>
             </w:r>
           </w:p>
         </w:tc>
@@ -2224,7 +2279,7 @@
                 <w:sz w:val="20"/>
                 <w:szCs w:val="20"/>
               </w:rPr>
-              <w:t xml:space="preserve">Individual paper trades — entry/exit price, target, stop loss, status</w:t>
+              <w:t xml:space="preserve">Individual paper trades — entry/exit price, target, stop loss, target_notified_at/stop_notified_at (notification dedupe)</w:t>
             </w:r>
           </w:p>
         </w:tc>
@@ -2625,7 +2680,15 @@
         <w:pStyle w:val="Heading1"/>
       </w:pPr>
       <w:r>
-        <w:t xml:space="preserve">5. Infrastructure Reference</w:t>
+        <w:t xml:space="preserve">5. Market Hours, Trading Calendar &amp; Order Gating</w:t>
+      </w:r>
+    </w:p>
+    <w:p>
+      <w:pPr>
+        <w:spacing w:after="160"/>
+      </w:pPr>
+      <w:r>
+        <w:t xml:space="preserve">Paper trade orders are blocked while the relevant market is closed — executing instantly at a stale last-close price would be unrealistic (a real market can gap through that exact price by next open) and undercuts the whole point of paper trading as practice.</w:t>
       </w:r>
     </w:p>
     <w:p>
@@ -2633,7 +2696,7 @@
         <w:pStyle w:val="Heading2"/>
       </w:pPr>
       <w:r>
-        <w:t xml:space="preserve">5.1 Railway (backend)</w:t>
+        <w:t xml:space="preserve">5.1 Dual implementation, kept in sync</w:t>
       </w:r>
     </w:p>
     <w:p>
@@ -2646,7 +2709,7 @@
         <w:spacing w:after="80"/>
       </w:pPr>
       <w:r>
-        <w:t xml:space="preserve">Service watches the GitHub repo and redeploys on push — scoped to backend/** only via railway.json's build.watchPatterns, so frontend-only or docs-only commits don't trigger an unnecessary restart.</w:t>
+        <w:t xml:space="preserve">Frontend: frontend/src/utils/marketHours.ts — getMarketStatus(market) drives both the navbar's live status pills and the PaperTradeModal's order-gating banner.</w:t>
       </w:r>
     </w:p>
     <w:p>
@@ -2659,7 +2722,15 @@
         <w:spacing w:after="80"/>
       </w:pPr>
       <w:r>
-        <w:t xml:space="preserve">Environment variables include DATABASE_URL (Postgres), PICKS_SECRET (protects the manual /api/picks/generate trigger), RESEND_API_KEY (for paper-trade proximity emails).</w:t>
+        <w:t xml:space="preserve">Backend: backend/services/market_hours.py — a shared module (previously duplicated, with zero holiday awareness, inline in paper_trading.py and screener_service.py) that both routers now import. A direct API call bypassing the frontend gate is still blocked server-side.</w:t>
+      </w:r>
+    </w:p>
+    <w:p>
+      <w:pPr>
+        <w:pStyle w:val="Heading2"/>
+      </w:pPr>
+      <w:r>
+        <w:t xml:space="preserve">5.2 Holiday calendar</w:t>
       </w:r>
     </w:p>
     <w:p>
@@ -2672,15 +2743,7 @@
         <w:spacing w:after="80"/>
       </w:pPr>
       <w:r>
-        <w:t xml:space="preserve">Several asyncio background loops run inside the same process: daily picks catch-up, validation scheduling, yfinance session refresh, outcome resolution, and the paper-trade notifier.</w:t>
-      </w:r>
-    </w:p>
-    <w:p>
-      <w:pPr>
-        <w:pStyle w:val="Heading2"/>
-      </w:pPr>
-      <w:r>
-        <w:t xml:space="preserve">5.2 Vercel (frontend)</w:t>
+        <w:t xml:space="preserve">Fixed-date holidays are computed automatically for any year — Republic Day, Ambedkar Jayanti, Good Friday (via an Easter algorithm), Maharashtra Day, Independence Day, Gandhi Jayanti, Christmas (India); the equivalent set of US federal holidays.</w:t>
       </w:r>
     </w:p>
     <w:p>
@@ -2693,7 +2756,7 @@
         <w:spacing w:after="80"/>
       </w:pPr>
       <w:r>
-        <w:t xml:space="preserve">Deploys automatically on every push to main; preview deployments are created for other branches/PRs.</w:t>
+        <w:t xml:space="preserve">Lunar/regional Indian holidays (Holi, Diwali, Eid, Dussehra, Ram Navami, Guru Nanak Jayanti, etc.) have no closed-form formula — hardcoded per year in NSE_EXTRA_HOLIDAYS (both copies), sourced from NSE's official circular. Needs a manual refresh every December for the following year.</w:t>
       </w:r>
     </w:p>
     <w:p>
@@ -2706,7 +2769,28 @@
         <w:spacing w:after="80"/>
       </w:pPr>
       <w:r>
-        <w:t xml:space="preserve">Two custom domains attached: stocksense360.com and stocksense360.in (plus a www variant), all pointing at the same Vercel project.</w:t>
+        <w:t xml:space="preserve">Muhurat trading — NSE/BSE's special ~1hr evening session on Diwali Laxmi Pujan, held despite that date otherwise being a holiday — is modeled via a MUHURAT_SESSIONS override. Exact timing is announced by NSE only ~2 weeks before Diwali, so it's a placeholder until then each year.</w:t>
+      </w:r>
+    </w:p>
+    <w:p>
+      <w:pPr>
+        <w:spacing w:after="160"/>
+      </w:pPr>
+      <w:r>
+        <w:t xml:space="preserve">Both refresh cadences are tracked in project memory so they aren't forgotten: the holiday list around December 28th each year, and the Muhurat timing in late October.</w:t>
+      </w:r>
+    </w:p>
+    <w:p>
+      <w:r>
+        <w:br w:type="page"/>
+      </w:r>
+    </w:p>
+    <w:p>
+      <w:pPr>
+        <w:pStyle w:val="Heading1"/>
+      </w:pPr>
+      <w:r>
+        <w:t xml:space="preserve">6. Infrastructure Reference</w:t>
       </w:r>
     </w:p>
     <w:p>
@@ -2714,7 +2798,7 @@
         <w:pStyle w:val="Heading2"/>
       </w:pPr>
       <w:r>
-        <w:t xml:space="preserve">5.3 Supabase</w:t>
+        <w:t xml:space="preserve">6.1 Railway (backend)</w:t>
       </w:r>
     </w:p>
     <w:p>
@@ -2727,7 +2811,7 @@
         <w:spacing w:after="80"/>
       </w:pPr>
       <w:r>
-        <w:t xml:space="preserve">Auth → URL Configuration must list every domain's /auth/callback as an allowed redirect URL, or invite/reset links silently fail.</w:t>
+        <w:t xml:space="preserve">Service watches the GitHub repo and redeploys on push — scoped to backend/** only via railway.json's build.watchPatterns, so frontend-only or docs-only commits don't trigger an unnecessary restart.</w:t>
       </w:r>
     </w:p>
     <w:p>
@@ -2740,15 +2824,7 @@
         <w:spacing w:after="80"/>
       </w:pPr>
       <w:r>
-        <w:t xml:space="preserve">Custom SMTP (Resend) configured under Authentication → Emails → SMTP Settings, separate from the backend's own Resend usage for proximity alerts.</w:t>
-      </w:r>
-    </w:p>
-    <w:p>
-      <w:pPr>
-        <w:pStyle w:val="Heading2"/>
-      </w:pPr>
-      <w:r>
-        <w:t xml:space="preserve">5.4 GitHub Actions</w:t>
+        <w:t xml:space="preserve">Environment variables include DATABASE_URL (Postgres), PICKS_SECRET (protects the manual /api/picks/generate trigger), RESEND_API_KEY (for paper-trade proximity emails).</w:t>
       </w:r>
     </w:p>
     <w:p>
@@ -2761,7 +2837,15 @@
         <w:spacing w:after="80"/>
       </w:pPr>
       <w:r>
-        <w:t xml:space="preserve">daily_picks.yml — fires once daily, POSTs to /api/picks/generate with the shared secret. The backend itself also has a self-healing catch-up check in case this cron is ever missed.</w:t>
+        <w:t xml:space="preserve">Several asyncio background loops run inside the same process: daily picks catch-up, validation scheduling, yfinance session refresh, outcome resolution, and the paper-trade notifier (checks every 15 min, 6-hour cooldown per trigger).</w:t>
+      </w:r>
+    </w:p>
+    <w:p>
+      <w:pPr>
+        <w:pStyle w:val="Heading2"/>
+      </w:pPr>
+      <w:r>
+        <w:t xml:space="preserve">6.2 Vercel (frontend)</w:t>
       </w:r>
     </w:p>
     <w:p>
@@ -2774,20 +2858,7 @@
         <w:spacing w:after="80"/>
       </w:pPr>
       <w:r>
-        <w:t xml:space="preserve">keep_alive.yml — periodic ping to prevent any free-tier cold-start behavior on dependent services.</w:t>
-      </w:r>
-    </w:p>
-    <w:p>
-      <w:r>
-        <w:br w:type="page"/>
-      </w:r>
-    </w:p>
-    <w:p>
-      <w:pPr>
-        <w:pStyle w:val="Heading1"/>
-      </w:pPr>
-      <w:r>
-        <w:t xml:space="preserve">6. Known Limitations &amp; Deferred Work</w:t>
+        <w:t xml:space="preserve">Deploys automatically on every push to main; preview deployments are created for other branches/PRs.</w:t>
       </w:r>
     </w:p>
     <w:p>
@@ -2800,7 +2871,15 @@
         <w:spacing w:after="80"/>
       </w:pPr>
       <w:r>
-        <w:t xml:space="preserve">Daily Picks is India (NSE) only — the US market equivalent is scoped but not yet built (tracked as a pending task). Validation already supports a US universe; Picks generation does not.</w:t>
+        <w:t xml:space="preserve">Two custom domains attached: stocksense360.com and stocksense360.in (plus a www variant), all pointing at the same Vercel project.</w:t>
+      </w:r>
+    </w:p>
+    <w:p>
+      <w:pPr>
+        <w:pStyle w:val="Heading2"/>
+      </w:pPr>
+      <w:r>
+        <w:t xml:space="preserve">6.3 Supabase</w:t>
       </w:r>
     </w:p>
     <w:p>
@@ -2813,7 +2892,7 @@
         <w:spacing w:after="80"/>
       </w:pPr>
       <w:r>
-        <w:t xml:space="preserve">Monetisation (subscription tiers via Razorpay) is intentionally deferred to roughly December 2026, pending 6 months of real validation track record.</w:t>
+        <w:t xml:space="preserve">Auth → URL Configuration must list every domain's /auth/callback as an allowed redirect URL, or invite/reset links silently fail.</w:t>
       </w:r>
     </w:p>
     <w:p>
@@ -2826,7 +2905,15 @@
         <w:spacing w:after="80"/>
       </w:pPr>
       <w:r>
-        <w:t xml:space="preserve">Push notifications only work while a browser tab is open (Notification API) or via email — there is no installed mobile app or PWA push channel yet.</w:t>
+        <w:t xml:space="preserve">Custom SMTP (Resend) configured under Authentication → Emails → SMTP Settings, separate from the backend's own Resend usage for proximity alerts.</w:t>
+      </w:r>
+    </w:p>
+    <w:p>
+      <w:pPr>
+        <w:pStyle w:val="Heading2"/>
+      </w:pPr>
+      <w:r>
+        <w:t xml:space="preserve">6.4 GitHub Actions</w:t>
       </w:r>
     </w:p>
     <w:p>
@@ -2839,7 +2926,98 @@
         <w:spacing w:after="80"/>
       </w:pPr>
       <w:r>
+        <w:t xml:space="preserve">daily_picks.yml — fires once daily, POSTs to /api/picks/generate with the shared secret. The backend itself also has a self-healing catch-up check in case this cron is ever missed.</w:t>
+      </w:r>
+    </w:p>
+    <w:p>
+      <w:pPr>
+        <w:pStyle w:val="ListParagraph"/>
+        <w:numPr>
+          <w:ilvl w:val="0"/>
+          <w:numId w:val="2"/>
+        </w:numPr>
+        <w:spacing w:after="80"/>
+      </w:pPr>
+      <w:r>
+        <w:t xml:space="preserve">keep_alive.yml — periodic ping to prevent any free-tier cold-start behavior on dependent services.</w:t>
+      </w:r>
+    </w:p>
+    <w:p>
+      <w:r>
+        <w:br w:type="page"/>
+      </w:r>
+    </w:p>
+    <w:p>
+      <w:pPr>
+        <w:pStyle w:val="Heading1"/>
+      </w:pPr>
+      <w:r>
+        <w:t xml:space="preserve">7. Known Limitations &amp; Deferred Work</w:t>
+      </w:r>
+    </w:p>
+    <w:p>
+      <w:pPr>
+        <w:pStyle w:val="ListParagraph"/>
+        <w:numPr>
+          <w:ilvl w:val="0"/>
+          <w:numId w:val="2"/>
+        </w:numPr>
+        <w:spacing w:after="80"/>
+      </w:pPr>
+      <w:r>
+        <w:t xml:space="preserve">Daily Picks is India (NSE) only — the US market equivalent is scoped but not yet built (tracked as a pending task). Validation already supports a US universe; Picks generation does not.</w:t>
+      </w:r>
+    </w:p>
+    <w:p>
+      <w:pPr>
+        <w:pStyle w:val="ListParagraph"/>
+        <w:numPr>
+          <w:ilvl w:val="0"/>
+          <w:numId w:val="2"/>
+        </w:numPr>
+        <w:spacing w:after="80"/>
+      </w:pPr>
+      <w:r>
+        <w:t xml:space="preserve">Monetisation (subscription tiers via Razorpay) is intentionally deferred to roughly December 2026, pending 6 months of real validation track record.</w:t>
+      </w:r>
+    </w:p>
+    <w:p>
+      <w:pPr>
+        <w:pStyle w:val="ListParagraph"/>
+        <w:numPr>
+          <w:ilvl w:val="0"/>
+          <w:numId w:val="2"/>
+        </w:numPr>
+        <w:spacing w:after="80"/>
+      </w:pPr>
+      <w:r>
+        <w:t xml:space="preserve">Push notifications work via email (any time) or a browser popup (only while a tab is open, Notification API) — there is no installed mobile app or PWA push channel yet.</w:t>
+      </w:r>
+    </w:p>
+    <w:p>
+      <w:pPr>
+        <w:pStyle w:val="ListParagraph"/>
+        <w:numPr>
+          <w:ilvl w:val="0"/>
+          <w:numId w:val="2"/>
+        </w:numPr>
+        <w:spacing w:after="80"/>
+      </w:pPr>
+      <w:r>
         <w:t xml:space="preserve">The fundamental-rejection screening step in Daily Picks generation is sequential (not parallelized), making a full run take ~70 minutes — acceptable for an overnight job but a candidate for optimization if the window ever tightens.</w:t>
+      </w:r>
+    </w:p>
+    <w:p>
+      <w:pPr>
+        <w:pStyle w:val="ListParagraph"/>
+        <w:numPr>
+          <w:ilvl w:val="0"/>
+          <w:numId w:val="2"/>
+        </w:numPr>
+        <w:spacing w:after="80"/>
+      </w:pPr>
+      <w:r>
+        <w:t xml:space="preserve">Commodities (Gold/Silver, tracked via GLD/SLV/GOLDBEES/SILVERBEES) are technical-signal-only by design — no fundamentals-driven AI BUY/SELL recommendation, and out of scope for Daily Picks.</w:t>
       </w:r>
     </w:p>
     <w:p>

</xml_diff>